<commit_message>
fix: authenticate AtomicBot report relationships
</commit_message>
<xml_diff>
--- a/docs/testing/final-results/02-atomicbot-turboquant/workbook/generated/atomicbot-turboquant-final-report.docx
+++ b/docs/testing/final-results/02-atomicbot-turboquant/workbook/generated/atomicbot-turboquant-final-report.docx
@@ -3072,7 +3072,7 @@
     </w:p>
     <w:p>
       <w:r>
-        <w:t>WB-02 v1.7 controls the exact 19-row ladder. The publication normalizes existing evidence and does not rerun inference. The workbook's Quality /10 and Status cells were overwritten by duplicate CPU/GPU triples in all 19 result rows; those cells are excluded. Runtime status comes from the Test-Run register, performance/utilization from the Performance register and current summaries, and quality from the Quality-Evaluation register and current quality artifacts.</w:t>
+        <w:t>WB-02 v1.7 controls the exact 19-row ladder. The publication normalizes existing evidence and does not rerun inference. The workbook's Quality /10 and Status cells were overwritten by duplicate CPU/GPU triples in all 19 result rows; every duplicate pair is reconciled to the exact current performance aggregate before those cells are excluded. Runtime status comes from the Test-Run register, performance/utilization from the Performance register and current summaries, and quality from independently authenticated quality authorities.</w:t>
       </w:r>
     </w:p>
     <w:p>
@@ -12334,7 +12334,7 @@
     </w:p>
     <w:p>
       <w:r>
-        <w:t>Each of 114 outputs is bound by SHA-256 to GTQ-PROMPTS-v1, GTQ-QUALITY-RUBRIC-v1, a content-keyed adjudication, a Quality-Evaluation register row, and its per-test summary. Scores are recomputed from weighted dimensions (30/25/20/15/10) and the smallest applicable critical cap; all 19 means are recomputed. The application remains limited/provisional, calibration is Not collected, and results are not directly comparable with OpenVINO.</w:t>
+        <w:t>Each of 114 outputs is bound by SHA-256 to GTQ-PROMPTS-v1, GTQ-QUALITY-RUBRIC-v1, a content-keyed adjudication, a Quality-Evaluation register row, and its per-test summary. The summary, adjudication, and register authorities are independently pinned, so coordinated internally consistent edits cannot redefine published quality. Scores are recomputed from weighted dimensions (30/25/20/15/10) and the smallest applicable critical cap; all 19 means are recomputed. The application remains limited/provisional, calibration is Not collected, and results are not directly comparable with OpenVINO.</w:t>
       </w:r>
     </w:p>
     <w:p>
@@ -36414,7 +36414,7 @@
     </w:p>
     <w:p>
       <w:r>
-        <w:t>R1 (2026-07-17): initial unified evidence-bound publication from WB-02 v1.7. R1 hardening receipt: authority-file binding, full score recomputation, separated performance provenance, workbook-corruption precedence, typed deviations, exact stale-index inventory, and portable outputs. Generated DOCX/PDF are derivatives.</w:t>
+        <w:t>R1 (2026-07-17): initial unified evidence-bound publication from WB-02 v1.7. R1 hardening receipt: independently pinned quality authorities, full score recomputation, separated performance provenance, exact workbook-duplicate value reconciliation, explicit deviation relationships, exact stale-index inventory, and portable outputs. Generated DOCX/PDF are derivatives.</w:t>
       </w:r>
     </w:p>
     <w:sectPr>

</xml_diff>